<commit_message>
Drop the last date from the walkthrough script
The Notion page now says "the end of week 15", so the screen-share cue
and the spoken line match it.

Co-Authored-By: Claude Opus 5.5 <noreply@anthropic.com>
Claude-Session: https://claude.ai/code/session_01J7uUwrP8LBDCmbx24NcmAV
</commit_message>
<xml_diff>
--- a/stackle-video/scripts/senior-to-staff-de-notion-walkthrough.docx
+++ b/stackle-video/scripts/senior-to-staff-de-notion-walkthrough.docx
@@ -204,7 +204,7 @@
           <w:color w:val="6B7080"/>
           <w:sz w:val="20"/>
         </w:rPr>
-        <w:t>[Screen share: the top of the Notion page, "The targets by January 3"]</w:t>
+        <w:t>[Screen share: the top of the Notion page, "The targets by the end of week 15"]</w:t>
       </w:r>
     </w:p>
     <w:p>
@@ -212,7 +212,7 @@
         <w:rPr>
           <w:b w:val="0"/>
         </w:rPr>
-        <w:t>So here's the page. At the top are my targets for January third. That's a hundred fifty DSA problems, forty-seven advanced SQL problems, thirty Python questions, sixteen system designs, and twenty-five debugging scenarios. It's also ten stories from my own work, and one real project, which is a distributed AI platform.</w:t>
+        <w:t>So here's the page. At the top are my targets for the end of week fifteen. That's a hundred fifty DSA problems, forty-seven advanced SQL problems, thirty Python questions, sixteen system designs, and twenty-five debugging scenarios. It's also ten stories from my own work, and one real project, which is a distributed AI platform.</w:t>
       </w:r>
     </w:p>
     <w:p>

</xml_diff>

<commit_message>
Shape the walkthrough script to the hook, open loop and recap framework
Uses only what the script already had: a viewer line in the hook, a
promise at the top that Part 6 pays off, and a recap before Your turn.

Co-Authored-By: Claude Opus 5.5 <noreply@anthropic.com>
Claude-Session: https://claude.ai/code/session_01J7uUwrP8LBDCmbx24NcmAV
</commit_message>
<xml_diff>
--- a/stackle-video/scripts/senior-to-staff-de-notion-walkthrough.docx
+++ b/stackle-video/scripts/senior-to-staff-de-notion-walkthrough.docx
@@ -15,7 +15,7 @@
         <w:rPr>
           <w:color w:val="6B7080"/>
         </w:rPr>
-        <w:t>YouTube script, Notion screen-share version. Length: about 16.5 minutes at 150 words a minute.</w:t>
+        <w:t>YouTube script, Notion screen-share version. Length: about 17.5 minutes at 150 words a minute.</w:t>
       </w:r>
     </w:p>
     <w:p>
@@ -44,7 +44,7 @@
         <w:rPr>
           <w:b w:val="0"/>
         </w:rPr>
-        <w:t>I'm a senior data engineer at Meta, where the average base salary at my level is about two hundred twenty thousand dollars a year. The staff-level data jobs I'm going after at AI companies pay three hundred fifty to four hundred thousand in base salary, and some pay more. So I built a fifteen-week plan to make that jump, and I'm in week four right now. In this video, I'm going to open the exact Notion page I'm using and walk you through it week by week. You'll see what I study, the problems I solve, the system designs I practise, the project I'm building, and the three real jobs I'm preparing for. You can copy all of it.</w:t>
+        <w:t>I'm a senior data engineer at Meta, where the average base salary at my level is about two hundred twenty thousand dollars a year. The staff-level data jobs I'm going after at AI companies pay three hundred fifty to four hundred thousand in base salary, and some pay more. So I built a fifteen-week plan to make that jump, and I'm in week four right now. In this video, I'm going to open the exact Notion page I'm using and walk you through it week by week. You'll see what I study, the problems I solve, the system designs I practise, the project I'm building, and the three real jobs I'm preparing for. If you're a senior engineer who wants to make the same jump, you can copy all of it. And at the end, I'll show you the part I think most people miss.</w:t>
       </w:r>
     </w:p>
     <w:p>
@@ -966,7 +966,7 @@
         <w:rPr>
           <w:b w:val="0"/>
         </w:rPr>
-        <w:t>The last part is the one I think most people miss, which is getting your stories right. A behavioral round just means the interview where they ask about things you've actually done, like "Tell me about a time you disagreed with another team." Amazon's own interview guide says each interviewer will typically ask two or three of these questions. So the page has twenty-four questions, two a week, and ten story slots.</w:t>
+        <w:t>Now let's get to the part I promised you at the start. It's the one I think most people miss, which is getting your stories right. A behavioral round just means the interview where they ask about things you've actually done, like "Tell me about a time you disagreed with another team." Amazon's own interview guide says each interviewer will typically ask two or three of these questions. So the page has twenty-four questions, two a week, and ten story slots.</w:t>
       </w:r>
     </w:p>
     <w:p>
@@ -1001,6 +1001,35 @@
           <w:sz w:val="20"/>
         </w:rPr>
         <w:t>[Pause]</w:t>
+      </w:r>
+    </w:p>
+    <w:p>
+      <w:pPr>
+        <w:pStyle w:val="Heading1"/>
+      </w:pPr>
+      <w:r>
+        <w:t>Recap</w:t>
+      </w:r>
+    </w:p>
+    <w:p>
+      <w:pPr>
+        <w:spacing w:after="40"/>
+      </w:pPr>
+      <w:r>
+        <w:rPr>
+          <w:i/>
+          <w:color w:val="6B7080"/>
+          <w:sz w:val="20"/>
+        </w:rPr>
+        <w:t>[On camera]</w:t>
+      </w:r>
+    </w:p>
+    <w:p>
+      <w:r>
+        <w:rPr>
+          <w:b w:val="0"/>
+        </w:rPr>
+        <w:t>So the whole plan comes down to three things. Senior gets you hired for what you can build, and staff gets you hired for what you can design. The order is system design first, then coding, then data and AI infrastructure. And the proof is one real project, a resume where every line shows a decision, and ten stories you've written down.</w:t>
       </w:r>
     </w:p>
     <w:p>

</xml_diff>